<commit_message>
Paper: S2/S3 filled, repository cited, seed-averaging note
Co-Authored-By: Claude Fable 5.1 <noreply@anthropic.com>
</commit_message>
<xml_diff>
--- a/paper/word/TAMES_AI_manuscript.docx
+++ b/paper/word/TAMES_AI_manuscript.docx
@@ -10479,7 +10479,7 @@
         <w:pStyle w:val="FirstParagraph"/>
       </w:pPr>
       <w:r>
-        <w:t xml:space="preserve">The analysis plan below was fixed before the test partition was scored and is implemented verbatim in the released code. All confidence intervals are 95 % intervals from 2,000 bootstrap resamples of the test images; predictions of the five seeds are averaged before the metrics are computed and the seed-to-seed standard deviation of the AUC is reported alongside.</w:t>
+        <w:t xml:space="preserve">The analysis plan below was fixed before the test partition was scored and is implemented verbatim in the released code. All confidence intervals are 95 % intervals from 2,000 bootstrap resamples of the test images; predictions of the five seeds are averaged before the metrics are computed, for every model alike, and the seed-to-seed standard deviation of the AUC is reported alongside. This seed average is itself a small ensemble and raises the AUC of every model above its single-seed value; the per-seed values are given in Supplementary Table S3.</w:t>
       </w:r>
     </w:p>
     <w:tbl>
@@ -11392,7 +11392,7 @@
               <w:rPr>
                 <w:sz w:val="18"/>
               </w:rPr>
-              <w:t xml:space="preserve">[[public repository URL, commit hash]]; trained weights [[DOI]]</w:t>
+              <w:t xml:space="preserve">https://github.com/Mrkomiljon/tames-ai, commit 4a863f5; trained weights [[DOI]]</w:t>
             </w:r>
           </w:p>
         </w:tc>
@@ -13179,7 +13179,7 @@
         <w:t xml:space="preserve"> </w:t>
       </w:r>
       <w:r>
-        <w:t xml:space="preserve">= 0.42 at τ = 0.05, i.e. the ensemble leaned on the two learners with the lowest validation log-loss.</w:t>
+        <w:t xml:space="preserve">= 0.42 at τ = 0.05, i.e. the ensemble leaned on the two learners with the lowest validation log-loss. The single-seed AUCs were lower for every model (mean 0.774 for TAMES AI, 0.804 for the image-only CNN; Supplementary Table S3): averaging the five seeds adds about 0.03–0.04 AUC to each model alike, so the comparisons above are unaffected by it.</w:t>
       </w:r>
     </w:p>
     <w:p>
@@ -17074,7 +17074,7 @@
         <w:t xml:space="preserve"> </w:t>
       </w:r>
       <w:r>
-        <w:t xml:space="preserve">Training and evaluation code, the statistical analysis plan and the trained weights are available at [[repository URL, commit hash, DOI]].</w:t>
+        <w:t xml:space="preserve">Training and evaluation code, the statistical analysis plan and the trained weights are available at https://github.com/Mrkomiljon/tames-ai (commit 4a863f5); the trained weights are deposited at [[Zenodo DOI]].</w:t>
       </w:r>
     </w:p>
     <w:p>

</xml_diff>